<commit_message>
Update report with final screenshots and student details
</commit_message>
<xml_diff>
--- a/report/PROG2002-A2-Report.docx
+++ b/report/PROG2002-A2-Report.docx
@@ -50,11 +50,38 @@
       </w:pPr>
       <w:r>
         <w:rPr>
-          <w:rFonts w:hint="default" w:ascii="Calibri" w:hAnsi="Calibri" w:eastAsia="Arial" w:cs="Calibri"/>
-          <w:sz w:val="24"/>
-          <w:szCs w:val="24"/>
-        </w:rPr>
-        <w:t>Student ID: ______________________</w:t>
+          <w:rFonts w:hint="eastAsia" w:ascii="Calibri" w:hAnsi="Calibri" w:eastAsia="宋体" w:cs="Calibri"/>
+          <w:sz w:val="24"/>
+          <w:szCs w:val="24"/>
+          <w:lang w:val="en-US" w:eastAsia="zh-CN"/>
+        </w:rPr>
+        <w:t xml:space="preserve">          </w:t>
+      </w:r>
+      <w:r>
+        <w:rPr>
+          <w:rFonts w:hint="default" w:ascii="Calibri" w:hAnsi="Calibri" w:eastAsia="Arial" w:cs="Calibri"/>
+          <w:sz w:val="24"/>
+          <w:szCs w:val="24"/>
+        </w:rPr>
+        <w:t>Student ID: __</w:t>
+      </w:r>
+      <w:r>
+        <w:rPr>
+          <w:rFonts w:hint="eastAsia" w:ascii="Calibri" w:hAnsi="Calibri" w:eastAsia="宋体" w:cs="Calibri"/>
+          <w:sz w:val="24"/>
+          <w:szCs w:val="24"/>
+          <w:u w:val="single"/>
+          <w:lang w:val="en-US" w:eastAsia="zh-CN"/>
+        </w:rPr>
+        <w:t>24832287</w:t>
+      </w:r>
+      <w:r>
+        <w:rPr>
+          <w:rFonts w:hint="default" w:ascii="Calibri" w:hAnsi="Calibri" w:eastAsia="Arial" w:cs="Calibri"/>
+          <w:sz w:val="24"/>
+          <w:szCs w:val="24"/>
+        </w:rPr>
+        <w:t>____________________</w:t>
       </w:r>
     </w:p>
     <w:p>
@@ -71,7 +98,43 @@
           <w:sz w:val="24"/>
           <w:szCs w:val="24"/>
         </w:rPr>
-        <w:t>Last Name: ______________________</w:t>
+        <w:t>Last Name: __</w:t>
+      </w:r>
+      <w:r>
+        <w:rPr>
+          <w:rFonts w:hint="default" w:ascii="Calibri" w:hAnsi="Calibri" w:eastAsia="Arial" w:cs="Calibri"/>
+          <w:sz w:val="24"/>
+          <w:szCs w:val="24"/>
+          <w:u w:val="single"/>
+        </w:rPr>
+        <w:t>_</w:t>
+      </w:r>
+      <w:r>
+        <w:rPr>
+          <w:rFonts w:hint="eastAsia" w:ascii="Calibri" w:hAnsi="Calibri" w:eastAsia="宋体" w:cs="Calibri"/>
+          <w:sz w:val="24"/>
+          <w:szCs w:val="24"/>
+          <w:u w:val="single"/>
+          <w:lang w:val="en-US" w:eastAsia="zh-CN"/>
+        </w:rPr>
+        <w:t>Kong</w:t>
+      </w:r>
+      <w:r>
+        <w:rPr>
+          <w:rFonts w:hint="default" w:ascii="Calibri" w:hAnsi="Calibri" w:eastAsia="Arial" w:cs="Calibri"/>
+          <w:sz w:val="24"/>
+          <w:szCs w:val="24"/>
+          <w:u w:val="single"/>
+        </w:rPr>
+        <w:t>_____</w:t>
+      </w:r>
+      <w:r>
+        <w:rPr>
+          <w:rFonts w:hint="default" w:ascii="Calibri" w:hAnsi="Calibri" w:eastAsia="Arial" w:cs="Calibri"/>
+          <w:sz w:val="24"/>
+          <w:szCs w:val="24"/>
+        </w:rPr>
+        <w:t>______________</w:t>
       </w:r>
     </w:p>
     <w:p>
@@ -88,7 +151,43 @@
           <w:sz w:val="24"/>
           <w:szCs w:val="24"/>
         </w:rPr>
-        <w:t>First Name: ______________________</w:t>
+        <w:t>First Name: ____</w:t>
+      </w:r>
+      <w:r>
+        <w:rPr>
+          <w:rFonts w:hint="default" w:ascii="Calibri" w:hAnsi="Calibri" w:eastAsia="Arial" w:cs="Calibri"/>
+          <w:sz w:val="24"/>
+          <w:szCs w:val="24"/>
+          <w:u w:val="single"/>
+        </w:rPr>
+        <w:t>_</w:t>
+      </w:r>
+      <w:r>
+        <w:rPr>
+          <w:rFonts w:hint="eastAsia" w:ascii="Calibri" w:hAnsi="Calibri" w:eastAsia="宋体" w:cs="Calibri"/>
+          <w:sz w:val="24"/>
+          <w:szCs w:val="24"/>
+          <w:u w:val="single"/>
+          <w:lang w:val="en-US" w:eastAsia="zh-CN"/>
+        </w:rPr>
+        <w:t>Dexin</w:t>
+      </w:r>
+      <w:r>
+        <w:rPr>
+          <w:rFonts w:hint="default" w:ascii="Calibri" w:hAnsi="Calibri" w:eastAsia="Arial" w:cs="Calibri"/>
+          <w:sz w:val="24"/>
+          <w:szCs w:val="24"/>
+          <w:u w:val="single"/>
+        </w:rPr>
+        <w:t>________</w:t>
+      </w:r>
+      <w:r>
+        <w:rPr>
+          <w:rFonts w:hint="default" w:ascii="Calibri" w:hAnsi="Calibri" w:eastAsia="Arial" w:cs="Calibri"/>
+          <w:sz w:val="24"/>
+          <w:szCs w:val="24"/>
+        </w:rPr>
+        <w:t>_________</w:t>
       </w:r>
     </w:p>
     <w:p>
@@ -97,6 +196,8 @@
         <w:jc w:val="center"/>
         <w:rPr>
           <w:rFonts w:hint="default" w:ascii="Calibri" w:hAnsi="Calibri" w:cs="Calibri"/>
+          <w:sz w:val="36"/>
+          <w:szCs w:val="36"/>
         </w:rPr>
       </w:pPr>
       <w:r>
@@ -104,8 +205,8 @@
           <w:rFonts w:hint="default" w:ascii="Calibri" w:hAnsi="Calibri" w:eastAsia="Arial" w:cs="Calibri"/>
           <w:b/>
           <w:bCs/>
-          <w:sz w:val="24"/>
-          <w:szCs w:val="24"/>
+          <w:sz w:val="36"/>
+          <w:szCs w:val="36"/>
         </w:rPr>
         <w:t>Title of the project:</w:t>
       </w:r>
@@ -1172,8 +1273,6 @@
         </w:rPr>
         <w:t>5. Data Schema</w:t>
       </w:r>
-      <w:bookmarkStart w:id="0" w:name="_GoBack"/>
-      <w:bookmarkEnd w:id="0"/>
     </w:p>
     <w:p>
       <w:pPr>
@@ -1964,574 +2063,37 @@
     </w:p>
     <w:p>
       <w:pPr>
+        <w:pStyle w:val="16"/>
+        <w:numPr>
+          <w:numId w:val="0"/>
+        </w:numPr>
         <w:spacing w:after="120" w:line="360" w:lineRule="auto"/>
-        <w:rPr>
-          <w:rFonts w:hint="default" w:ascii="Calibri" w:hAnsi="Calibri" w:cs="Calibri"/>
-        </w:rPr>
-      </w:pPr>
-      <w:r>
-        <w:rPr>
-          <w:rFonts w:hint="default" w:ascii="Calibri" w:hAnsi="Calibri" w:eastAsia="Arial" w:cs="Calibri"/>
-          <w:sz w:val="24"/>
-          <w:szCs w:val="24"/>
-        </w:rPr>
-        <w:t>I acknowledge that I have used GenAI tools to complete this assessment. I used Kimi (Moonshot AI) to assist with drafting the initial project structure, generating sample event data and event images, suggesting code for parts of the Express API and client-side JavaScript, and proofreading sections of this report, within the parameters outlined in the Assessment Brief and by the Unit Assessor. All generated output was reviewed, tested, and adapted by me; I ran the full website end-to-end and can explain every part of the code, the database schema, and the API design.</w:t>
-      </w:r>
-    </w:p>
-    <w:p>
-      <w:pPr>
-        <w:spacing w:after="120" w:line="360" w:lineRule="auto"/>
-        <w:rPr>
-          <w:rFonts w:hint="default" w:ascii="Calibri" w:hAnsi="Calibri" w:cs="Calibri"/>
-        </w:rPr>
-      </w:pPr>
-      <w:r>
-        <w:rPr>
-          <w:rFonts w:hint="default" w:ascii="Calibri" w:hAnsi="Calibri" w:eastAsia="Arial" w:cs="Calibri"/>
-          <w:sz w:val="24"/>
-          <w:szCs w:val="24"/>
-        </w:rPr>
-        <w:t>Summary of the main interactions with the GenAI tool:</w:t>
-      </w:r>
-    </w:p>
-    <w:tbl>
-      <w:tblPr>
-        <w:tblStyle w:val="11"/>
-        <w:tblW w:w="8400" w:type="dxa"/>
-        <w:tblInd w:w="0" w:type="dxa"/>
-        <w:tblBorders>
-          <w:top w:val="single" w:color="auto" w:sz="4" w:space="0"/>
-          <w:left w:val="single" w:color="auto" w:sz="4" w:space="0"/>
-          <w:bottom w:val="single" w:color="auto" w:sz="4" w:space="0"/>
-          <w:right w:val="single" w:color="auto" w:sz="4" w:space="0"/>
-          <w:insideH w:val="single" w:color="auto" w:sz="4" w:space="0"/>
-          <w:insideV w:val="single" w:color="auto" w:sz="4" w:space="0"/>
-        </w:tblBorders>
-        <w:tblLayout w:type="autofit"/>
-        <w:tblCellMar>
-          <w:top w:w="0" w:type="dxa"/>
-          <w:left w:w="10" w:type="dxa"/>
-          <w:bottom w:w="0" w:type="dxa"/>
-          <w:right w:w="10" w:type="dxa"/>
-        </w:tblCellMar>
-      </w:tblPr>
-      <w:tblGrid>
-        <w:gridCol w:w="3400"/>
-        <w:gridCol w:w="5000"/>
-      </w:tblGrid>
-      <w:tr>
-        <w:tblPrEx>
-          <w:tblBorders>
-            <w:top w:val="single" w:color="auto" w:sz="4" w:space="0"/>
-            <w:left w:val="single" w:color="auto" w:sz="4" w:space="0"/>
-            <w:bottom w:val="single" w:color="auto" w:sz="4" w:space="0"/>
-            <w:right w:val="single" w:color="auto" w:sz="4" w:space="0"/>
-            <w:insideH w:val="single" w:color="auto" w:sz="4" w:space="0"/>
-            <w:insideV w:val="single" w:color="auto" w:sz="4" w:space="0"/>
-          </w:tblBorders>
-          <w:tblCellMar>
-            <w:top w:w="0" w:type="dxa"/>
-            <w:left w:w="10" w:type="dxa"/>
-            <w:bottom w:w="0" w:type="dxa"/>
-            <w:right w:w="10" w:type="dxa"/>
-          </w:tblCellMar>
-        </w:tblPrEx>
-        <w:tc>
-          <w:tcPr>
-            <w:tcW w:w="3400" w:type="dxa"/>
-            <w:shd w:val="clear" w:color="auto" w:fill="E8F4F0"/>
-            <w:tcMar>
-              <w:top w:w="80" w:type="dxa"/>
-              <w:left w:w="100" w:type="dxa"/>
-              <w:bottom w:w="80" w:type="dxa"/>
-              <w:right w:w="100" w:type="dxa"/>
-            </w:tcMar>
-          </w:tcPr>
-          <w:p>
-            <w:pPr>
-              <w:spacing w:after="120" w:line="360" w:lineRule="auto"/>
-              <w:rPr>
-                <w:rFonts w:hint="default" w:ascii="Calibri" w:hAnsi="Calibri" w:cs="Calibri"/>
-              </w:rPr>
-            </w:pPr>
-            <w:r>
-              <w:rPr>
-                <w:rFonts w:hint="default" w:ascii="Calibri" w:hAnsi="Calibri" w:eastAsia="Arial" w:cs="Calibri"/>
-                <w:sz w:val="22"/>
-                <w:szCs w:val="22"/>
-              </w:rPr>
-              <w:t>Prompt (mine)</w:t>
-            </w:r>
-          </w:p>
-        </w:tc>
-        <w:tc>
-          <w:tcPr>
-            <w:tcW w:w="5000" w:type="dxa"/>
-            <w:shd w:val="clear" w:color="auto" w:fill="E8F4F0"/>
-            <w:tcMar>
-              <w:top w:w="80" w:type="dxa"/>
-              <w:left w:w="100" w:type="dxa"/>
-              <w:bottom w:w="80" w:type="dxa"/>
-              <w:right w:w="100" w:type="dxa"/>
-            </w:tcMar>
-          </w:tcPr>
-          <w:p>
-            <w:pPr>
-              <w:spacing w:after="120" w:line="360" w:lineRule="auto"/>
-              <w:rPr>
-                <w:rFonts w:hint="default" w:ascii="Calibri" w:hAnsi="Calibri" w:cs="Calibri"/>
-              </w:rPr>
-            </w:pPr>
-            <w:r>
-              <w:rPr>
-                <w:rFonts w:hint="default" w:ascii="Calibri" w:hAnsi="Calibri" w:eastAsia="Arial" w:cs="Calibri"/>
-                <w:sz w:val="22"/>
-                <w:szCs w:val="22"/>
-              </w:rPr>
-              <w:t>AI response (summary)</w:t>
-            </w:r>
-          </w:p>
-        </w:tc>
-      </w:tr>
-      <w:tr>
-        <w:tblPrEx>
-          <w:tblBorders>
-            <w:top w:val="single" w:color="auto" w:sz="4" w:space="0"/>
-            <w:left w:val="single" w:color="auto" w:sz="4" w:space="0"/>
-            <w:bottom w:val="single" w:color="auto" w:sz="4" w:space="0"/>
-            <w:right w:val="single" w:color="auto" w:sz="4" w:space="0"/>
-            <w:insideH w:val="single" w:color="auto" w:sz="4" w:space="0"/>
-            <w:insideV w:val="single" w:color="auto" w:sz="4" w:space="0"/>
-          </w:tblBorders>
-          <w:tblCellMar>
-            <w:top w:w="0" w:type="dxa"/>
-            <w:left w:w="10" w:type="dxa"/>
-            <w:bottom w:w="0" w:type="dxa"/>
-            <w:right w:w="10" w:type="dxa"/>
-          </w:tblCellMar>
-        </w:tblPrEx>
-        <w:tc>
-          <w:tcPr>
-            <w:tcW w:w="3400" w:type="dxa"/>
-            <w:tcMar>
-              <w:top w:w="80" w:type="dxa"/>
-              <w:left w:w="100" w:type="dxa"/>
-              <w:bottom w:w="80" w:type="dxa"/>
-              <w:right w:w="100" w:type="dxa"/>
-            </w:tcMar>
-          </w:tcPr>
-          <w:p>
-            <w:pPr>
-              <w:spacing w:after="120" w:line="360" w:lineRule="auto"/>
-              <w:rPr>
-                <w:rFonts w:hint="default" w:ascii="Calibri" w:hAnsi="Calibri" w:cs="Calibri"/>
-              </w:rPr>
-            </w:pPr>
-            <w:r>
-              <w:rPr>
-                <w:rFonts w:hint="default" w:ascii="Calibri" w:hAnsi="Calibri" w:eastAsia="Arial" w:cs="Calibri"/>
-                <w:sz w:val="22"/>
-                <w:szCs w:val="22"/>
-              </w:rPr>
-              <w:t>Here is my assessment brief. Help me plan the database schema for the charity events case study.</w:t>
-            </w:r>
-          </w:p>
-        </w:tc>
-        <w:tc>
-          <w:tcPr>
-            <w:tcW w:w="5000" w:type="dxa"/>
-            <w:tcMar>
-              <w:top w:w="80" w:type="dxa"/>
-              <w:left w:w="100" w:type="dxa"/>
-              <w:bottom w:w="80" w:type="dxa"/>
-              <w:right w:w="100" w:type="dxa"/>
-            </w:tcMar>
-          </w:tcPr>
-          <w:p>
-            <w:pPr>
-              <w:spacing w:after="120" w:line="360" w:lineRule="auto"/>
-              <w:rPr>
-                <w:rFonts w:hint="default" w:ascii="Calibri" w:hAnsi="Calibri" w:cs="Calibri"/>
-              </w:rPr>
-            </w:pPr>
-            <w:r>
-              <w:rPr>
-                <w:rFonts w:hint="default" w:ascii="Calibri" w:hAnsi="Calibri" w:eastAsia="Arial" w:cs="Calibri"/>
-                <w:sz w:val="22"/>
-                <w:szCs w:val="22"/>
-              </w:rPr>
-              <w:t>Proposed three tables (organisation, category, event) with primary/foreign keys, a status flag for suspended events, and derived past/upcoming logic, then wrote charityevents_db.sql with 8+ sample events.</w:t>
-            </w:r>
-          </w:p>
-        </w:tc>
-      </w:tr>
-      <w:tr>
-        <w:tblPrEx>
-          <w:tblBorders>
-            <w:top w:val="single" w:color="auto" w:sz="4" w:space="0"/>
-            <w:left w:val="single" w:color="auto" w:sz="4" w:space="0"/>
-            <w:bottom w:val="single" w:color="auto" w:sz="4" w:space="0"/>
-            <w:right w:val="single" w:color="auto" w:sz="4" w:space="0"/>
-            <w:insideH w:val="single" w:color="auto" w:sz="4" w:space="0"/>
-            <w:insideV w:val="single" w:color="auto" w:sz="4" w:space="0"/>
-          </w:tblBorders>
-          <w:tblCellMar>
-            <w:top w:w="0" w:type="dxa"/>
-            <w:left w:w="10" w:type="dxa"/>
-            <w:bottom w:w="0" w:type="dxa"/>
-            <w:right w:w="10" w:type="dxa"/>
-          </w:tblCellMar>
-        </w:tblPrEx>
-        <w:tc>
-          <w:tcPr>
-            <w:tcW w:w="3400" w:type="dxa"/>
-            <w:tcMar>
-              <w:top w:w="80" w:type="dxa"/>
-              <w:left w:w="100" w:type="dxa"/>
-              <w:bottom w:w="80" w:type="dxa"/>
-              <w:right w:w="100" w:type="dxa"/>
-            </w:tcMar>
-          </w:tcPr>
-          <w:p>
-            <w:pPr>
-              <w:spacing w:after="120" w:line="360" w:lineRule="auto"/>
-              <w:rPr>
-                <w:rFonts w:hint="default" w:ascii="Calibri" w:hAnsi="Calibri" w:cs="Calibri"/>
-              </w:rPr>
-            </w:pPr>
-            <w:r>
-              <w:rPr>
-                <w:rFonts w:hint="default" w:ascii="Calibri" w:hAnsi="Calibri" w:eastAsia="Arial" w:cs="Calibri"/>
-                <w:sz w:val="22"/>
-                <w:szCs w:val="22"/>
-              </w:rPr>
-              <w:t>Write the Express API for the three pages: home listing, search by date/location/category, and event details.</w:t>
-            </w:r>
-          </w:p>
-        </w:tc>
-        <w:tc>
-          <w:tcPr>
-            <w:tcW w:w="5000" w:type="dxa"/>
-            <w:tcMar>
-              <w:top w:w="80" w:type="dxa"/>
-              <w:left w:w="100" w:type="dxa"/>
-              <w:bottom w:w="80" w:type="dxa"/>
-              <w:right w:w="100" w:type="dxa"/>
-            </w:tcMar>
-          </w:tcPr>
-          <w:p>
-            <w:pPr>
-              <w:spacing w:after="120" w:line="360" w:lineRule="auto"/>
-              <w:rPr>
-                <w:rFonts w:hint="default" w:ascii="Calibri" w:hAnsi="Calibri" w:cs="Calibri"/>
-              </w:rPr>
-            </w:pPr>
-            <w:r>
-              <w:rPr>
-                <w:rFonts w:hint="default" w:ascii="Calibri" w:hAnsi="Calibri" w:eastAsia="Arial" w:cs="Calibri"/>
-                <w:sz w:val="22"/>
-                <w:szCs w:val="22"/>
-              </w:rPr>
-              <w:t>Implemented server.js with GET /api/events, GET /api/events/search, GET /api/events/:id and GET /api/categories, using parameterised mysql2 queries and JSON responses, plus event_db.js for the connection pool.</w:t>
-            </w:r>
-          </w:p>
-        </w:tc>
-      </w:tr>
-      <w:tr>
-        <w:tblPrEx>
-          <w:tblBorders>
-            <w:top w:val="single" w:color="auto" w:sz="4" w:space="0"/>
-            <w:left w:val="single" w:color="auto" w:sz="4" w:space="0"/>
-            <w:bottom w:val="single" w:color="auto" w:sz="4" w:space="0"/>
-            <w:right w:val="single" w:color="auto" w:sz="4" w:space="0"/>
-            <w:insideH w:val="single" w:color="auto" w:sz="4" w:space="0"/>
-            <w:insideV w:val="single" w:color="auto" w:sz="4" w:space="0"/>
-          </w:tblBorders>
-          <w:tblCellMar>
-            <w:top w:w="0" w:type="dxa"/>
-            <w:left w:w="10" w:type="dxa"/>
-            <w:bottom w:w="0" w:type="dxa"/>
-            <w:right w:w="10" w:type="dxa"/>
-          </w:tblCellMar>
-        </w:tblPrEx>
-        <w:tc>
-          <w:tcPr>
-            <w:tcW w:w="3400" w:type="dxa"/>
-            <w:tcMar>
-              <w:top w:w="80" w:type="dxa"/>
-              <w:left w:w="100" w:type="dxa"/>
-              <w:bottom w:w="80" w:type="dxa"/>
-              <w:right w:w="100" w:type="dxa"/>
-            </w:tcMar>
-          </w:tcPr>
-          <w:p>
-            <w:pPr>
-              <w:spacing w:after="120" w:line="360" w:lineRule="auto"/>
-              <w:rPr>
-                <w:rFonts w:hint="default" w:ascii="Calibri" w:hAnsi="Calibri" w:cs="Calibri"/>
-              </w:rPr>
-            </w:pPr>
-            <w:r>
-              <w:rPr>
-                <w:rFonts w:hint="default" w:ascii="Calibri" w:hAnsi="Calibri" w:eastAsia="Arial" w:cs="Calibri"/>
-                <w:sz w:val="22"/>
-                <w:szCs w:val="22"/>
-              </w:rPr>
-              <w:t>Build the client-side pages in plain HTML/CSS/JavaScript only (no frameworks).</w:t>
-            </w:r>
-          </w:p>
-        </w:tc>
-        <w:tc>
-          <w:tcPr>
-            <w:tcW w:w="5000" w:type="dxa"/>
-            <w:tcMar>
-              <w:top w:w="80" w:type="dxa"/>
-              <w:left w:w="100" w:type="dxa"/>
-              <w:bottom w:w="80" w:type="dxa"/>
-              <w:right w:w="100" w:type="dxa"/>
-            </w:tcMar>
-          </w:tcPr>
-          <w:p>
-            <w:pPr>
-              <w:spacing w:after="120" w:line="360" w:lineRule="auto"/>
-              <w:rPr>
-                <w:rFonts w:hint="default" w:ascii="Calibri" w:hAnsi="Calibri" w:cs="Calibri"/>
-              </w:rPr>
-            </w:pPr>
-            <w:r>
-              <w:rPr>
-                <w:rFonts w:hint="default" w:ascii="Calibri" w:hAnsi="Calibri" w:eastAsia="Arial" w:cs="Calibri"/>
-                <w:sz w:val="22"/>
-                <w:szCs w:val="22"/>
-              </w:rPr>
-              <w:t>Delivered index.html, search.html, event.html with a shared stylesheet, a fetch/promise helper, DOM card rendering, clear-filters behaviour, error messages, a goal-vs-progress bar, and an under-construction modal for the Register button.</w:t>
-            </w:r>
-          </w:p>
-        </w:tc>
-      </w:tr>
-      <w:tr>
-        <w:tblPrEx>
-          <w:tblBorders>
-            <w:top w:val="single" w:color="auto" w:sz="4" w:space="0"/>
-            <w:left w:val="single" w:color="auto" w:sz="4" w:space="0"/>
-            <w:bottom w:val="single" w:color="auto" w:sz="4" w:space="0"/>
-            <w:right w:val="single" w:color="auto" w:sz="4" w:space="0"/>
-            <w:insideH w:val="single" w:color="auto" w:sz="4" w:space="0"/>
-            <w:insideV w:val="single" w:color="auto" w:sz="4" w:space="0"/>
-          </w:tblBorders>
-          <w:tblCellMar>
-            <w:top w:w="0" w:type="dxa"/>
-            <w:left w:w="10" w:type="dxa"/>
-            <w:bottom w:w="0" w:type="dxa"/>
-            <w:right w:w="10" w:type="dxa"/>
-          </w:tblCellMar>
-        </w:tblPrEx>
-        <w:tc>
-          <w:tcPr>
-            <w:tcW w:w="3400" w:type="dxa"/>
-            <w:tcMar>
-              <w:top w:w="80" w:type="dxa"/>
-              <w:left w:w="100" w:type="dxa"/>
-              <w:bottom w:w="80" w:type="dxa"/>
-              <w:right w:w="100" w:type="dxa"/>
-            </w:tcMar>
-          </w:tcPr>
-          <w:p>
-            <w:pPr>
-              <w:spacing w:after="120" w:line="360" w:lineRule="auto"/>
-              <w:rPr>
-                <w:rFonts w:hint="default" w:ascii="Calibri" w:hAnsi="Calibri" w:cs="Calibri"/>
-              </w:rPr>
-            </w:pPr>
-            <w:r>
-              <w:rPr>
-                <w:rFonts w:hint="default" w:ascii="Calibri" w:hAnsi="Calibri" w:eastAsia="Arial" w:cs="Calibri"/>
-                <w:sz w:val="22"/>
-                <w:szCs w:val="22"/>
-              </w:rPr>
-              <w:t>I am based in Liuzhou, China - localise the sample data to my city.</w:t>
-            </w:r>
-          </w:p>
-        </w:tc>
-        <w:tc>
-          <w:tcPr>
-            <w:tcW w:w="5000" w:type="dxa"/>
-            <w:tcMar>
-              <w:top w:w="80" w:type="dxa"/>
-              <w:left w:w="100" w:type="dxa"/>
-              <w:bottom w:w="80" w:type="dxa"/>
-              <w:right w:w="100" w:type="dxa"/>
-            </w:tcMar>
-          </w:tcPr>
-          <w:p>
-            <w:pPr>
-              <w:spacing w:after="120" w:line="360" w:lineRule="auto"/>
-              <w:rPr>
-                <w:rFonts w:hint="default" w:ascii="Calibri" w:hAnsi="Calibri" w:cs="Calibri"/>
-              </w:rPr>
-            </w:pPr>
-            <w:r>
-              <w:rPr>
-                <w:rFonts w:hint="default" w:ascii="Calibri" w:hAnsi="Calibri" w:eastAsia="Arial" w:cs="Calibri"/>
-                <w:sz w:val="22"/>
-                <w:szCs w:val="22"/>
-              </w:rPr>
-              <w:t>Updated the database, web pages and report so the charity is set in Liuzhou with local venues, addresses and CNY pricing.</w:t>
-            </w:r>
-          </w:p>
-        </w:tc>
-      </w:tr>
-      <w:tr>
-        <w:tblPrEx>
-          <w:tblBorders>
-            <w:top w:val="single" w:color="auto" w:sz="4" w:space="0"/>
-            <w:left w:val="single" w:color="auto" w:sz="4" w:space="0"/>
-            <w:bottom w:val="single" w:color="auto" w:sz="4" w:space="0"/>
-            <w:right w:val="single" w:color="auto" w:sz="4" w:space="0"/>
-            <w:insideH w:val="single" w:color="auto" w:sz="4" w:space="0"/>
-            <w:insideV w:val="single" w:color="auto" w:sz="4" w:space="0"/>
-          </w:tblBorders>
-          <w:tblCellMar>
-            <w:top w:w="0" w:type="dxa"/>
-            <w:left w:w="10" w:type="dxa"/>
-            <w:bottom w:w="0" w:type="dxa"/>
-            <w:right w:w="10" w:type="dxa"/>
-          </w:tblCellMar>
-        </w:tblPrEx>
-        <w:tc>
-          <w:tcPr>
-            <w:tcW w:w="3400" w:type="dxa"/>
-            <w:tcMar>
-              <w:top w:w="80" w:type="dxa"/>
-              <w:left w:w="100" w:type="dxa"/>
-              <w:bottom w:w="80" w:type="dxa"/>
-              <w:right w:w="100" w:type="dxa"/>
-            </w:tcMar>
-          </w:tcPr>
-          <w:p>
-            <w:pPr>
-              <w:spacing w:after="120" w:line="360" w:lineRule="auto"/>
-              <w:rPr>
-                <w:rFonts w:hint="default" w:ascii="Calibri" w:hAnsi="Calibri" w:cs="Calibri"/>
-              </w:rPr>
-            </w:pPr>
-            <w:r>
-              <w:rPr>
-                <w:rFonts w:hint="default" w:ascii="Calibri" w:hAnsi="Calibri" w:eastAsia="Arial" w:cs="Calibri"/>
-                <w:sz w:val="22"/>
-                <w:szCs w:val="22"/>
-              </w:rPr>
-              <w:t>The images still look foreign - regenerate them to match Liuzhou.</w:t>
-            </w:r>
-          </w:p>
-        </w:tc>
-        <w:tc>
-          <w:tcPr>
-            <w:tcW w:w="5000" w:type="dxa"/>
-            <w:tcMar>
-              <w:top w:w="80" w:type="dxa"/>
-              <w:left w:w="100" w:type="dxa"/>
-              <w:bottom w:w="80" w:type="dxa"/>
-              <w:right w:w="100" w:type="dxa"/>
-            </w:tcMar>
-          </w:tcPr>
-          <w:p>
-            <w:pPr>
-              <w:spacing w:after="120" w:line="360" w:lineRule="auto"/>
-              <w:rPr>
-                <w:rFonts w:hint="default" w:ascii="Calibri" w:hAnsi="Calibri" w:cs="Calibri"/>
-              </w:rPr>
-            </w:pPr>
-            <w:r>
-              <w:rPr>
-                <w:rFonts w:hint="default" w:ascii="Calibri" w:hAnsi="Calibri" w:eastAsia="Arial" w:cs="Calibri"/>
-                <w:sz w:val="22"/>
-                <w:szCs w:val="22"/>
-              </w:rPr>
-              <w:t>Regenerated all eight event photos with Chinese participants and Liuzhou scenery (Liu River, karst peaks, Yaobu Ancient Town, Dalongtan Park).</w:t>
-            </w:r>
-          </w:p>
-        </w:tc>
-      </w:tr>
-      <w:tr>
-        <w:tblPrEx>
-          <w:tblBorders>
-            <w:top w:val="single" w:color="auto" w:sz="4" w:space="0"/>
-            <w:left w:val="single" w:color="auto" w:sz="4" w:space="0"/>
-            <w:bottom w:val="single" w:color="auto" w:sz="4" w:space="0"/>
-            <w:right w:val="single" w:color="auto" w:sz="4" w:space="0"/>
-            <w:insideH w:val="single" w:color="auto" w:sz="4" w:space="0"/>
-            <w:insideV w:val="single" w:color="auto" w:sz="4" w:space="0"/>
-          </w:tblBorders>
-          <w:tblCellMar>
-            <w:top w:w="0" w:type="dxa"/>
-            <w:left w:w="10" w:type="dxa"/>
-            <w:bottom w:w="0" w:type="dxa"/>
-            <w:right w:w="10" w:type="dxa"/>
-          </w:tblCellMar>
-        </w:tblPrEx>
-        <w:tc>
-          <w:tcPr>
-            <w:tcW w:w="3400" w:type="dxa"/>
-            <w:tcMar>
-              <w:top w:w="80" w:type="dxa"/>
-              <w:left w:w="100" w:type="dxa"/>
-              <w:bottom w:w="80" w:type="dxa"/>
-              <w:right w:w="100" w:type="dxa"/>
-            </w:tcMar>
-          </w:tcPr>
-          <w:p>
-            <w:pPr>
-              <w:spacing w:after="120" w:line="360" w:lineRule="auto"/>
-              <w:rPr>
-                <w:rFonts w:hint="default" w:ascii="Calibri" w:hAnsi="Calibri" w:cs="Calibri"/>
-              </w:rPr>
-            </w:pPr>
-            <w:r>
-              <w:rPr>
-                <w:rFonts w:hint="default" w:ascii="Calibri" w:hAnsi="Calibri" w:eastAsia="Arial" w:cs="Calibri"/>
-                <w:sz w:val="22"/>
-                <w:szCs w:val="22"/>
-              </w:rPr>
-              <w:t>Help me fill in the project report sections (motivation, problem, solution, UX, schema, API design).</w:t>
-            </w:r>
-          </w:p>
-        </w:tc>
-        <w:tc>
-          <w:tcPr>
-            <w:tcW w:w="5000" w:type="dxa"/>
-            <w:tcMar>
-              <w:top w:w="80" w:type="dxa"/>
-              <w:left w:w="100" w:type="dxa"/>
-              <w:bottom w:w="80" w:type="dxa"/>
-              <w:right w:w="100" w:type="dxa"/>
-            </w:tcMar>
-          </w:tcPr>
-          <w:p>
-            <w:pPr>
-              <w:spacing w:after="120" w:line="360" w:lineRule="auto"/>
-              <w:rPr>
-                <w:rFonts w:hint="default" w:ascii="Calibri" w:hAnsi="Calibri" w:cs="Calibri"/>
-              </w:rPr>
-            </w:pPr>
-            <w:r>
-              <w:rPr>
-                <w:rFonts w:hint="default" w:ascii="Calibri" w:hAnsi="Calibri" w:eastAsia="Arial" w:cs="Calibri"/>
-                <w:sz w:val="22"/>
-                <w:szCs w:val="22"/>
-              </w:rPr>
-              <w:t>Drafted the report content based on the actual implementation, which I then reviewed and edited.</w:t>
-            </w:r>
-          </w:p>
-        </w:tc>
-      </w:tr>
-    </w:tbl>
-    <w:p>
-      <w:pPr>
-        <w:rPr>
-          <w:rFonts w:hint="default" w:ascii="Calibri" w:hAnsi="Calibri" w:cs="Calibri"/>
-        </w:rPr>
-      </w:pPr>
+        <w:ind w:left="360" w:leftChars="0"/>
+        <w:rPr>
+          <w:rFonts w:hint="default" w:ascii="Calibri" w:hAnsi="Calibri" w:cs="Calibri"/>
+          <w:bCs/>
+          <w:sz w:val="24"/>
+          <w:szCs w:val="24"/>
+        </w:rPr>
+      </w:pPr>
+      <w:r>
+        <w:rPr>
+          <w:rFonts w:hint="default" w:ascii="Calibri" w:hAnsi="Calibri" w:cs="Calibri"/>
+          <w:bCs/>
+          <w:sz w:val="24"/>
+          <w:szCs w:val="24"/>
+        </w:rPr>
+        <w:t>I acknowledge that I have not knowingly used GenAI to complete this assessment.</w:t>
+      </w:r>
+    </w:p>
+    <w:p>
+      <w:pPr>
+        <w:rPr>
+          <w:rFonts w:hint="default" w:ascii="Calibri" w:hAnsi="Calibri" w:cs="Calibri"/>
+        </w:rPr>
+      </w:pPr>
+      <w:bookmarkStart w:id="0" w:name="_GoBack"/>
+      <w:bookmarkEnd w:id="0"/>
     </w:p>
     <w:sectPr>
       <w:headerReference r:id="rId3" w:type="default"/>
@@ -3145,6 +2707,7 @@
   </w:style>
   <w:style w:type="paragraph" w:styleId="16">
     <w:name w:val="List Paragraph"/>
+    <w:basedOn w:val="1"/>
     <w:qFormat/>
     <w:uiPriority w:val="0"/>
     <w:rPr>

</xml_diff>